<commit_message>
modif de la note de décision J1
</commit_message>
<xml_diff>
--- a/docs/perturbations/j1/Note de décision – Perturbation J1.docx
+++ b/docs/perturbations/j1/Note de décision – Perturbation J1.docx
@@ -24,6 +24,7 @@
           <w:rFonts w:ascii="Calibri" w:hAnsi="Calibri" w:cs="Calibri"/>
         </w:rPr>
       </w:pPr>
+      <w:proofErr w:type="gramStart"/>
       <w:r>
         <w:rPr>
           <w:rFonts w:ascii="Calibri" w:hAnsi="Calibri" w:cs="Calibri"/>
@@ -32,6 +33,7 @@
         </w:rPr>
         <w:t>Projet :</w:t>
       </w:r>
+      <w:proofErr w:type="gramEnd"/>
       <w:r>
         <w:rPr>
           <w:rFonts w:ascii="Calibri" w:hAnsi="Calibri" w:cs="Calibri"/>
@@ -44,6 +46,7 @@
         </w:rPr>
         <w:br/>
       </w:r>
+      <w:proofErr w:type="gramStart"/>
       <w:r>
         <w:rPr>
           <w:rFonts w:ascii="Calibri" w:hAnsi="Calibri" w:cs="Calibri"/>
@@ -52,6 +55,7 @@
         </w:rPr>
         <w:t>Équipe :</w:t>
       </w:r>
+      <w:proofErr w:type="gramEnd"/>
       <w:r>
         <w:rPr>
           <w:rFonts w:ascii="Calibri" w:hAnsi="Calibri" w:cs="Calibri"/>
@@ -70,33 +74,23 @@
           <w:b/>
           <w:bCs/>
         </w:rPr>
-        <w:t>Sprint concerné :</w:t>
-      </w:r>
-      <w:r>
-        <w:rPr>
-          <w:rFonts w:ascii="Calibri" w:hAnsi="Calibri" w:cs="Calibri"/>
-        </w:rPr>
-        <w:t xml:space="preserve"> Cadrage – Perturbation J1</w:t>
-      </w:r>
-      <w:r>
-        <w:rPr>
-          <w:rFonts w:ascii="Calibri" w:hAnsi="Calibri" w:cs="Calibri"/>
-        </w:rPr>
-        <w:br/>
-      </w:r>
+        <w:t xml:space="preserve">Sprint </w:t>
+      </w:r>
+      <w:proofErr w:type="gramStart"/>
       <w:r>
         <w:rPr>
           <w:rFonts w:ascii="Calibri" w:hAnsi="Calibri" w:cs="Calibri"/>
           <w:b/>
           <w:bCs/>
         </w:rPr>
-        <w:t>Version :</w:t>
-      </w:r>
-      <w:r>
-        <w:rPr>
-          <w:rFonts w:ascii="Calibri" w:hAnsi="Calibri" w:cs="Calibri"/>
-        </w:rPr>
-        <w:t xml:space="preserve"> v1.0</w:t>
+        <w:t>concerné :</w:t>
+      </w:r>
+      <w:proofErr w:type="gramEnd"/>
+      <w:r>
+        <w:rPr>
+          <w:rFonts w:ascii="Calibri" w:hAnsi="Calibri" w:cs="Calibri"/>
+        </w:rPr>
+        <w:t xml:space="preserve"> Cadrage – Perturbation J1</w:t>
       </w:r>
       <w:r>
         <w:rPr>
@@ -104,6 +98,7 @@
         </w:rPr>
         <w:br/>
       </w:r>
+      <w:proofErr w:type="gramStart"/>
       <w:r>
         <w:rPr>
           <w:rFonts w:ascii="Calibri" w:hAnsi="Calibri" w:cs="Calibri"/>
@@ -112,105 +107,564 @@
         </w:rPr>
         <w:t>Date :</w:t>
       </w:r>
+      <w:proofErr w:type="gramEnd"/>
       <w:r>
         <w:rPr>
           <w:rFonts w:ascii="Calibri" w:hAnsi="Calibri" w:cs="Calibri"/>
         </w:rPr>
         <w:t xml:space="preserve"> 29/06/2026</w:t>
       </w:r>
-    </w:p>
-    <w:p>
-      <w:pPr>
-        <w:rPr>
-          <w:rFonts w:ascii="Calibri" w:hAnsi="Calibri" w:cs="Calibri"/>
-        </w:rPr>
-      </w:pPr>
+      <w:bookmarkStart w:id="1" w:name="product-vision-board"/>
+      <w:bookmarkEnd w:id="0"/>
+    </w:p>
+    <w:p>
+      <w:pPr>
+        <w:pStyle w:val="FirstParagraph"/>
+        <w:rPr>
+          <w:rFonts w:ascii="Calibri" w:hAnsi="Calibri" w:cs="Calibri"/>
+        </w:rPr>
+      </w:pPr>
+      <w:r>
+        <w:rPr>
+          <w:rFonts w:ascii="Calibri" w:eastAsiaTheme="majorEastAsia" w:hAnsi="Calibri" w:cs="Calibri"/>
+          <w:color w:val="0F4761" w:themeColor="accent1" w:themeShade="BF"/>
+          <w:sz w:val="40"/>
+          <w:szCs w:val="40"/>
+          <w:lang w:val="fr-FR"/>
+        </w:rPr>
+        <w:t>Décision</w:t>
+      </w:r>
     </w:p>
     <w:p>
       <w:pPr>
         <w:pStyle w:val="Titre1"/>
         <w:rPr>
           <w:rFonts w:ascii="Calibri" w:hAnsi="Calibri" w:cs="Calibri"/>
-        </w:rPr>
-      </w:pPr>
-      <w:bookmarkStart w:id="1" w:name="contexte"/>
-      <w:bookmarkEnd w:id="0"/>
-      <w:r>
-        <w:rPr>
-          <w:rFonts w:ascii="Calibri" w:hAnsi="Calibri" w:cs="Calibri"/>
-        </w:rPr>
-        <w:t>Contexte</w:t>
-      </w:r>
-    </w:p>
-    <w:p>
-      <w:pPr>
-        <w:pStyle w:val="FirstParagraph"/>
-        <w:rPr>
-          <w:rFonts w:ascii="Calibri" w:hAnsi="Calibri" w:cs="Calibri"/>
-        </w:rPr>
-      </w:pPr>
-      <w:r>
-        <w:rPr>
-          <w:rFonts w:ascii="Calibri" w:hAnsi="Calibri" w:cs="Calibri"/>
-        </w:rPr>
-        <w:t xml:space="preserve">Lors de la perturbation J1, une nouvelle persona, </w:t>
+          <w:color w:val="auto"/>
+          <w:sz w:val="24"/>
+          <w:szCs w:val="24"/>
+          <w:lang w:val="fr-FR"/>
+        </w:rPr>
+      </w:pPr>
+      <w:r>
+        <w:rPr>
+          <w:rFonts w:ascii="Calibri" w:hAnsi="Calibri" w:cs="Calibri"/>
+          <w:color w:val="auto"/>
+          <w:sz w:val="24"/>
+          <w:szCs w:val="24"/>
+          <w:lang w:val="fr-FR"/>
+        </w:rPr>
+        <w:t xml:space="preserve">L'équipe décide de classer la </w:t>
       </w:r>
       <w:r>
         <w:rPr>
           <w:rFonts w:ascii="Calibri" w:hAnsi="Calibri" w:cs="Calibri"/>
           <w:b/>
           <w:bCs/>
-        </w:rPr>
-        <w:t>Mme Sophie Lefèvre</w:t>
-      </w:r>
-      <w:r>
-        <w:rPr>
-          <w:rFonts w:ascii="Calibri" w:hAnsi="Calibri" w:cs="Calibri"/>
-        </w:rPr>
-        <w:t xml:space="preserve">, enseignante, a été ajoutée au produit. Cette évolution implique d’intégrer les besoins des enseignants dans le périmètre fonctionnel d’EduTutor IA tout en conservant les </w:t>
+          <w:color w:val="auto"/>
+          <w:sz w:val="24"/>
+          <w:szCs w:val="24"/>
+          <w:lang w:val="fr-FR"/>
+        </w:rPr>
+        <w:t>cible enseignante (Mme Sophie Lefèvre) en MUST pour la Release 1</w:t>
+      </w:r>
+      <w:r>
+        <w:rPr>
+          <w:rFonts w:ascii="Calibri" w:hAnsi="Calibri" w:cs="Calibri"/>
+          <w:color w:val="auto"/>
+          <w:sz w:val="24"/>
+          <w:szCs w:val="24"/>
+          <w:lang w:val="fr-FR"/>
+        </w:rPr>
+        <w:t>.</w:t>
+      </w:r>
+    </w:p>
+    <w:p>
+      <w:pPr>
+        <w:pStyle w:val="Titre1"/>
+        <w:rPr>
+          <w:rFonts w:ascii="Calibri" w:hAnsi="Calibri" w:cs="Calibri"/>
+          <w:lang w:val="fr-FR"/>
+        </w:rPr>
+      </w:pPr>
+      <w:r>
+        <w:rPr>
+          <w:rFonts w:ascii="Calibri" w:hAnsi="Calibri" w:cs="Calibri"/>
+          <w:lang w:val="fr-FR"/>
+        </w:rPr>
+        <w:t>Justification</w:t>
+      </w:r>
+    </w:p>
+    <w:p>
+      <w:pPr>
+        <w:pStyle w:val="Titre1"/>
+        <w:rPr>
+          <w:rFonts w:ascii="Calibri" w:hAnsi="Calibri" w:cs="Calibri"/>
+          <w:color w:val="auto"/>
+          <w:sz w:val="24"/>
+          <w:szCs w:val="24"/>
+          <w:lang w:val="fr-FR"/>
+        </w:rPr>
+      </w:pPr>
+      <w:r>
+        <w:rPr>
+          <w:rFonts w:ascii="Calibri" w:hAnsi="Calibri" w:cs="Calibri"/>
+          <w:color w:val="auto"/>
+          <w:sz w:val="24"/>
+          <w:szCs w:val="24"/>
+          <w:lang w:val="fr-FR"/>
+        </w:rPr>
+        <w:t>Cette décision est motivée par la demande explicite du Product Owner, qui souhaite intégrer la nouvelle persona enseignante dans le périmètre de la Release 1. Il ne s'agit donc pas d'une fonctionnalité optionnelle mais d'une évolution du besoin métier imposée en cours de Sprint.</w:t>
+      </w:r>
+    </w:p>
+    <w:p>
+      <w:pPr>
+        <w:pStyle w:val="Titre1"/>
+        <w:rPr>
+          <w:rFonts w:ascii="Calibri" w:hAnsi="Calibri" w:cs="Calibri"/>
+          <w:color w:val="auto"/>
+          <w:sz w:val="24"/>
+          <w:szCs w:val="24"/>
+          <w:lang w:val="fr-FR"/>
+        </w:rPr>
+      </w:pPr>
+      <w:r>
+        <w:rPr>
+          <w:rFonts w:ascii="Calibri" w:hAnsi="Calibri" w:cs="Calibri"/>
+          <w:color w:val="auto"/>
+          <w:sz w:val="24"/>
+          <w:szCs w:val="24"/>
+          <w:lang w:val="fr-FR"/>
+        </w:rPr>
+        <w:t xml:space="preserve">Afin de limiter l'impact sur le planning et de préserver le MVP existant, l'équipe a choisi de </w:t>
+      </w:r>
+      <w:r>
+        <w:rPr>
+          <w:rFonts w:ascii="Calibri" w:hAnsi="Calibri" w:cs="Calibri"/>
+          <w:b/>
+          <w:bCs/>
+          <w:color w:val="auto"/>
+          <w:sz w:val="24"/>
+          <w:szCs w:val="24"/>
+          <w:lang w:val="fr-FR"/>
+        </w:rPr>
+        <w:t>conserver l'ensemble des fonctionnalités étudiantes</w:t>
+      </w:r>
+      <w:r>
+        <w:rPr>
+          <w:rFonts w:ascii="Calibri" w:hAnsi="Calibri" w:cs="Calibri"/>
+          <w:color w:val="auto"/>
+          <w:sz w:val="24"/>
+          <w:szCs w:val="24"/>
+          <w:lang w:val="fr-FR"/>
+        </w:rPr>
+        <w:t xml:space="preserve"> et d'ajouter uniquement les fonctionnalités indispensables permettant de répondre au besoin exprimé par Mme Lefèvre :</w:t>
+      </w:r>
+    </w:p>
+    <w:p>
+      <w:pPr>
+        <w:pStyle w:val="Titre1"/>
+        <w:numPr>
+          <w:ilvl w:val="0"/>
+          <w:numId w:val="4"/>
+        </w:numPr>
+        <w:rPr>
+          <w:rFonts w:ascii="Calibri" w:hAnsi="Calibri" w:cs="Calibri"/>
+          <w:color w:val="auto"/>
+          <w:sz w:val="24"/>
+          <w:szCs w:val="24"/>
+          <w:lang w:val="fr-FR"/>
+        </w:rPr>
+      </w:pPr>
+      <w:proofErr w:type="gramStart"/>
+      <w:r>
+        <w:rPr>
+          <w:rFonts w:ascii="Calibri" w:hAnsi="Calibri" w:cs="Calibri"/>
+          <w:color w:val="auto"/>
+          <w:sz w:val="24"/>
+          <w:szCs w:val="24"/>
+          <w:lang w:val="fr-FR"/>
+        </w:rPr>
+        <w:t>consulter</w:t>
+      </w:r>
+      <w:proofErr w:type="gramEnd"/>
+      <w:r>
+        <w:rPr>
+          <w:rFonts w:ascii="Calibri" w:hAnsi="Calibri" w:cs="Calibri"/>
+          <w:color w:val="auto"/>
+          <w:sz w:val="24"/>
+          <w:szCs w:val="24"/>
+          <w:lang w:val="fr-FR"/>
+        </w:rPr>
+        <w:t xml:space="preserve"> les résultats de sa classe ;</w:t>
+      </w:r>
+    </w:p>
+    <w:p>
+      <w:pPr>
+        <w:pStyle w:val="Titre1"/>
+        <w:numPr>
+          <w:ilvl w:val="0"/>
+          <w:numId w:val="4"/>
+        </w:numPr>
+        <w:rPr>
+          <w:rFonts w:ascii="Calibri" w:hAnsi="Calibri" w:cs="Calibri"/>
+          <w:color w:val="auto"/>
+          <w:sz w:val="24"/>
+          <w:szCs w:val="24"/>
+          <w:lang w:val="fr-FR"/>
+        </w:rPr>
+      </w:pPr>
+      <w:proofErr w:type="gramStart"/>
+      <w:r>
+        <w:rPr>
+          <w:rFonts w:ascii="Calibri" w:hAnsi="Calibri" w:cs="Calibri"/>
+          <w:color w:val="auto"/>
+          <w:sz w:val="24"/>
+          <w:szCs w:val="24"/>
+          <w:lang w:val="fr-FR"/>
+        </w:rPr>
+        <w:t>identifier</w:t>
+      </w:r>
+      <w:proofErr w:type="gramEnd"/>
+      <w:r>
+        <w:rPr>
+          <w:rFonts w:ascii="Calibri" w:hAnsi="Calibri" w:cs="Calibri"/>
+          <w:color w:val="auto"/>
+          <w:sz w:val="24"/>
+          <w:szCs w:val="24"/>
+          <w:lang w:val="fr-FR"/>
+        </w:rPr>
+        <w:t xml:space="preserve"> les étudiants en difficulté ;</w:t>
+      </w:r>
+    </w:p>
+    <w:p>
+      <w:pPr>
+        <w:pStyle w:val="Titre1"/>
+        <w:numPr>
+          <w:ilvl w:val="0"/>
+          <w:numId w:val="4"/>
+        </w:numPr>
+        <w:rPr>
+          <w:rFonts w:ascii="Calibri" w:hAnsi="Calibri" w:cs="Calibri"/>
+          <w:color w:val="auto"/>
+          <w:sz w:val="24"/>
+          <w:szCs w:val="24"/>
+          <w:lang w:val="fr-FR"/>
+        </w:rPr>
+      </w:pPr>
+      <w:proofErr w:type="gramStart"/>
+      <w:r>
+        <w:rPr>
+          <w:rFonts w:ascii="Calibri" w:hAnsi="Calibri" w:cs="Calibri"/>
+          <w:color w:val="auto"/>
+          <w:sz w:val="24"/>
+          <w:szCs w:val="24"/>
+          <w:lang w:val="fr-FR"/>
+        </w:rPr>
+        <w:t>disposer</w:t>
+      </w:r>
+      <w:proofErr w:type="gramEnd"/>
+      <w:r>
+        <w:rPr>
+          <w:rFonts w:ascii="Calibri" w:hAnsi="Calibri" w:cs="Calibri"/>
+          <w:color w:val="auto"/>
+          <w:sz w:val="24"/>
+          <w:szCs w:val="24"/>
+          <w:lang w:val="fr-FR"/>
+        </w:rPr>
+        <w:t xml:space="preserve"> d'un tableau de bord de suivi ;</w:t>
+      </w:r>
+    </w:p>
+    <w:p>
+      <w:pPr>
+        <w:pStyle w:val="Titre1"/>
+        <w:numPr>
+          <w:ilvl w:val="0"/>
+          <w:numId w:val="4"/>
+        </w:numPr>
+        <w:rPr>
+          <w:rFonts w:ascii="Calibri" w:hAnsi="Calibri" w:cs="Calibri"/>
+          <w:color w:val="auto"/>
+          <w:sz w:val="24"/>
+          <w:szCs w:val="24"/>
+          <w:lang w:val="fr-FR"/>
+        </w:rPr>
+      </w:pPr>
+      <w:proofErr w:type="gramStart"/>
+      <w:r>
+        <w:rPr>
+          <w:rFonts w:ascii="Calibri" w:hAnsi="Calibri" w:cs="Calibri"/>
+          <w:color w:val="auto"/>
+          <w:sz w:val="24"/>
+          <w:szCs w:val="24"/>
+          <w:lang w:val="fr-FR"/>
+        </w:rPr>
+        <w:t>envoyer</w:t>
+      </w:r>
+      <w:proofErr w:type="gramEnd"/>
+      <w:r>
+        <w:rPr>
+          <w:rFonts w:ascii="Calibri" w:hAnsi="Calibri" w:cs="Calibri"/>
+          <w:color w:val="auto"/>
+          <w:sz w:val="24"/>
+          <w:szCs w:val="24"/>
+          <w:lang w:val="fr-FR"/>
+        </w:rPr>
+        <w:t xml:space="preserve"> des conseils personnalisés aux étudiants.</w:t>
+      </w:r>
+    </w:p>
+    <w:p>
+      <w:pPr>
+        <w:pStyle w:val="Titre1"/>
+        <w:rPr>
+          <w:rFonts w:ascii="Calibri" w:hAnsi="Calibri" w:cs="Calibri"/>
+          <w:color w:val="auto"/>
+          <w:sz w:val="24"/>
+          <w:szCs w:val="24"/>
+          <w:lang w:val="fr-FR"/>
+        </w:rPr>
+      </w:pPr>
+      <w:r>
+        <w:rPr>
+          <w:rFonts w:ascii="Calibri" w:hAnsi="Calibri" w:cs="Calibri"/>
+          <w:color w:val="auto"/>
+          <w:sz w:val="24"/>
+          <w:szCs w:val="24"/>
+          <w:lang w:val="fr-FR"/>
+        </w:rPr>
+        <w:t>Les fonctionnalités plus avancées ou moins prioritaires restent planifiées pour les releases suivantes afin de respecter la capacité de l'équipe et de maintenir un MVP réaliste.</w:t>
+      </w:r>
+    </w:p>
+    <w:p>
+      <w:pPr>
+        <w:pStyle w:val="Titre1"/>
+        <w:rPr>
+          <w:rFonts w:ascii="Calibri" w:hAnsi="Calibri" w:cs="Calibri"/>
+          <w:color w:val="auto"/>
+          <w:sz w:val="24"/>
+          <w:szCs w:val="24"/>
+          <w:lang w:val="fr-FR"/>
+        </w:rPr>
+      </w:pPr>
+      <w:r>
+        <w:rPr>
+          <w:rFonts w:ascii="Calibri" w:hAnsi="Calibri" w:cs="Calibri"/>
+          <w:color w:val="auto"/>
+          <w:sz w:val="24"/>
+          <w:szCs w:val="24"/>
+          <w:lang w:val="fr-FR"/>
+        </w:rPr>
+        <w:t>Cette décision permet de satisfaire la nouvelle cible sans remettre en cause le cœur fonctionnel d'</w:t>
       </w:r>
       <w:proofErr w:type="spellStart"/>
       <w:r>
         <w:rPr>
           <w:rFonts w:ascii="Calibri" w:hAnsi="Calibri" w:cs="Calibri"/>
-        </w:rPr>
-        <w:t>fonctionnalités</w:t>
+          <w:color w:val="auto"/>
+          <w:sz w:val="24"/>
+          <w:szCs w:val="24"/>
+          <w:lang w:val="fr-FR"/>
+        </w:rPr>
+        <w:t>EduTutor</w:t>
       </w:r>
       <w:proofErr w:type="spellEnd"/>
       <w:r>
         <w:rPr>
           <w:rFonts w:ascii="Calibri" w:hAnsi="Calibri" w:cs="Calibri"/>
-        </w:rPr>
-        <w:t xml:space="preserve"> </w:t>
+          <w:color w:val="auto"/>
+          <w:sz w:val="24"/>
+          <w:szCs w:val="24"/>
+          <w:lang w:val="fr-FR"/>
+        </w:rPr>
+        <w:t xml:space="preserve"> IA ni les engagements déjà pris sur le produit.</w:t>
+      </w:r>
+    </w:p>
+    <w:p>
+      <w:pPr>
+        <w:pStyle w:val="Titre1"/>
+        <w:rPr>
+          <w:rFonts w:ascii="Calibri" w:hAnsi="Calibri" w:cs="Calibri"/>
+        </w:rPr>
+      </w:pPr>
+      <w:r>
+        <w:rPr>
+          <w:rFonts w:ascii="Calibri" w:hAnsi="Calibri" w:cs="Calibri"/>
+        </w:rPr>
+        <w:t>1. Product Vision Board</w:t>
+      </w:r>
+    </w:p>
+    <w:p>
+      <w:pPr>
+        <w:pStyle w:val="Corpsdetexte"/>
+        <w:rPr>
+          <w:rFonts w:ascii="Calibri" w:hAnsi="Calibri" w:cs="Calibri"/>
+          <w:i/>
+          <w:iCs/>
+        </w:rPr>
+      </w:pPr>
+      <w:r>
+        <w:rPr>
+          <w:rFonts w:ascii="Calibri" w:hAnsi="Calibri" w:cs="Calibri"/>
+          <w:i/>
+          <w:iCs/>
+        </w:rPr>
+        <w:t xml:space="preserve">(À </w:t>
       </w:r>
       <w:proofErr w:type="spellStart"/>
       <w:r>
         <w:rPr>
           <w:rFonts w:ascii="Calibri" w:hAnsi="Calibri" w:cs="Calibri"/>
-        </w:rPr>
-        <w:t>destinées</w:t>
+          <w:i/>
+          <w:iCs/>
+        </w:rPr>
+        <w:t>compléte</w:t>
+      </w:r>
+      <w:r>
+        <w:rPr>
+          <w:rFonts w:ascii="Calibri" w:hAnsi="Calibri" w:cs="Calibri"/>
+          <w:i/>
+          <w:iCs/>
+        </w:rPr>
+        <w:t>r</w:t>
       </w:r>
       <w:proofErr w:type="spellEnd"/>
       <w:r>
         <w:rPr>
           <w:rFonts w:ascii="Calibri" w:hAnsi="Calibri" w:cs="Calibri"/>
-        </w:rPr>
-        <w:t xml:space="preserve"> aux </w:t>
+          <w:i/>
+          <w:iCs/>
+        </w:rPr>
+        <w:t>)</w:t>
+      </w:r>
+    </w:p>
+    <w:p>
+      <w:pPr>
+        <w:pStyle w:val="Corpsdetexte"/>
+        <w:rPr>
+          <w:rFonts w:ascii="Calibri" w:hAnsi="Calibri" w:cs="Calibri"/>
+          <w:i/>
+          <w:iCs/>
+        </w:rPr>
+      </w:pPr>
+    </w:p>
+    <w:p>
+      <w:pPr>
+        <w:pStyle w:val="Corpsdetexte"/>
+        <w:rPr>
+          <w:rFonts w:ascii="Calibri" w:hAnsi="Calibri" w:cs="Calibri"/>
+          <w:i/>
+          <w:iCs/>
+        </w:rPr>
+      </w:pPr>
+    </w:p>
+    <w:p>
+      <w:pPr>
+        <w:rPr>
+          <w:rFonts w:ascii="Calibri" w:hAnsi="Calibri" w:cs="Calibri"/>
+        </w:rPr>
+      </w:pPr>
+    </w:p>
+    <w:p>
+      <w:pPr>
+        <w:rPr>
+          <w:rFonts w:ascii="Calibri" w:hAnsi="Calibri" w:cs="Calibri"/>
+        </w:rPr>
+      </w:pPr>
+    </w:p>
+    <w:p>
+      <w:pPr>
+        <w:rPr>
+          <w:rFonts w:ascii="Calibri" w:hAnsi="Calibri" w:cs="Calibri"/>
+        </w:rPr>
+      </w:pPr>
+    </w:p>
+    <w:p>
+      <w:pPr>
+        <w:pStyle w:val="Titre1"/>
+        <w:rPr>
+          <w:rFonts w:ascii="Calibri" w:hAnsi="Calibri" w:cs="Calibri"/>
+        </w:rPr>
+      </w:pPr>
+      <w:bookmarkStart w:id="2" w:name="personas"/>
+      <w:bookmarkEnd w:id="1"/>
+      <w:r>
+        <w:rPr>
+          <w:rFonts w:ascii="Calibri" w:hAnsi="Calibri" w:cs="Calibri"/>
+        </w:rPr>
+        <w:t>2. Personas</w:t>
+      </w:r>
+    </w:p>
+    <w:p>
+      <w:pPr>
+        <w:pStyle w:val="Corpsdetexte"/>
+        <w:rPr>
+          <w:rFonts w:ascii="Calibri" w:hAnsi="Calibri" w:cs="Calibri"/>
+          <w:i/>
+          <w:iCs/>
+        </w:rPr>
+      </w:pPr>
+      <w:r>
+        <w:rPr>
+          <w:rFonts w:ascii="Calibri" w:hAnsi="Calibri" w:cs="Calibri"/>
+          <w:i/>
+          <w:iCs/>
+        </w:rPr>
+        <w:t xml:space="preserve">(À </w:t>
       </w:r>
       <w:proofErr w:type="spellStart"/>
       <w:r>
         <w:rPr>
           <w:rFonts w:ascii="Calibri" w:hAnsi="Calibri" w:cs="Calibri"/>
-        </w:rPr>
-        <w:t>étudiants</w:t>
+          <w:i/>
+          <w:iCs/>
+        </w:rPr>
+        <w:t>compléter</w:t>
       </w:r>
       <w:proofErr w:type="spellEnd"/>
       <w:r>
         <w:rPr>
           <w:rFonts w:ascii="Calibri" w:hAnsi="Calibri" w:cs="Calibri"/>
-        </w:rPr>
-        <w:t>.</w:t>
-      </w:r>
+          <w:i/>
+          <w:iCs/>
+        </w:rPr>
+        <w:t>)</w:t>
+      </w:r>
+    </w:p>
+    <w:p>
+      <w:pPr>
+        <w:pStyle w:val="Corpsdetexte"/>
+        <w:rPr>
+          <w:rFonts w:ascii="Calibri" w:hAnsi="Calibri" w:cs="Calibri"/>
+          <w:i/>
+          <w:iCs/>
+        </w:rPr>
+      </w:pPr>
+    </w:p>
+    <w:p>
+      <w:pPr>
+        <w:pStyle w:val="Corpsdetexte"/>
+        <w:rPr>
+          <w:rFonts w:ascii="Calibri" w:hAnsi="Calibri" w:cs="Calibri"/>
+          <w:i/>
+          <w:iCs/>
+        </w:rPr>
+      </w:pPr>
+    </w:p>
+    <w:p>
+      <w:pPr>
+        <w:pStyle w:val="Corpsdetexte"/>
+        <w:rPr>
+          <w:rFonts w:ascii="Calibri" w:hAnsi="Calibri" w:cs="Calibri"/>
+        </w:rPr>
+      </w:pPr>
+    </w:p>
+    <w:p>
+      <w:pPr>
+        <w:pStyle w:val="Corpsdetexte"/>
+        <w:rPr>
+          <w:rFonts w:ascii="Calibri" w:hAnsi="Calibri" w:cs="Calibri"/>
+        </w:rPr>
+      </w:pPr>
     </w:p>
     <w:p>
       <w:pPr>
@@ -219,13 +673,13 @@
           <w:rFonts w:ascii="Calibri" w:hAnsi="Calibri" w:cs="Calibri"/>
         </w:rPr>
       </w:pPr>
-      <w:bookmarkStart w:id="2" w:name="product-vision-board"/>
-      <w:bookmarkEnd w:id="1"/>
-      <w:r>
-        <w:rPr>
-          <w:rFonts w:ascii="Calibri" w:hAnsi="Calibri" w:cs="Calibri"/>
-        </w:rPr>
-        <w:t>1. Product Vision Board</w:t>
+      <w:bookmarkStart w:id="3" w:name="customer-journey"/>
+      <w:bookmarkEnd w:id="2"/>
+      <w:r>
+        <w:rPr>
+          <w:rFonts w:ascii="Calibri" w:hAnsi="Calibri" w:cs="Calibri"/>
+        </w:rPr>
+        <w:t>3. Customer Journey</w:t>
       </w:r>
     </w:p>
     <w:p>
@@ -252,15 +706,7 @@
           <w:i/>
           <w:iCs/>
         </w:rPr>
-        <w:t>compléte</w:t>
-      </w:r>
-      <w:r>
-        <w:rPr>
-          <w:rFonts w:ascii="Calibri" w:hAnsi="Calibri" w:cs="Calibri"/>
-          <w:i/>
-          <w:iCs/>
-        </w:rPr>
-        <w:t>r</w:t>
+        <w:t>compléter</w:t>
       </w:r>
       <w:proofErr w:type="spellEnd"/>
       <w:r>
@@ -287,27 +733,12 @@
         <w:pStyle w:val="Corpsdetexte"/>
         <w:rPr>
           <w:rFonts w:ascii="Calibri" w:hAnsi="Calibri" w:cs="Calibri"/>
-          <w:i/>
-          <w:iCs/>
-        </w:rPr>
-      </w:pPr>
-    </w:p>
-    <w:p>
-      <w:pPr>
-        <w:rPr>
-          <w:rFonts w:ascii="Calibri" w:hAnsi="Calibri" w:cs="Calibri"/>
-        </w:rPr>
-      </w:pPr>
-    </w:p>
-    <w:p>
-      <w:pPr>
-        <w:rPr>
-          <w:rFonts w:ascii="Calibri" w:hAnsi="Calibri" w:cs="Calibri"/>
-        </w:rPr>
-      </w:pPr>
-    </w:p>
-    <w:p>
-      <w:pPr>
+        </w:rPr>
+      </w:pPr>
+    </w:p>
+    <w:p>
+      <w:pPr>
+        <w:pStyle w:val="Corpsdetexte"/>
         <w:rPr>
           <w:rFonts w:ascii="Calibri" w:hAnsi="Calibri" w:cs="Calibri"/>
         </w:rPr>
@@ -320,179 +751,12 @@
           <w:rFonts w:ascii="Calibri" w:hAnsi="Calibri" w:cs="Calibri"/>
         </w:rPr>
       </w:pPr>
-      <w:bookmarkStart w:id="3" w:name="personas"/>
-      <w:bookmarkEnd w:id="2"/>
-      <w:r>
-        <w:rPr>
-          <w:rFonts w:ascii="Calibri" w:hAnsi="Calibri" w:cs="Calibri"/>
-        </w:rPr>
-        <w:t>2. Personas</w:t>
-      </w:r>
-    </w:p>
-    <w:p>
-      <w:pPr>
-        <w:pStyle w:val="Corpsdetexte"/>
-        <w:rPr>
-          <w:rFonts w:ascii="Calibri" w:hAnsi="Calibri" w:cs="Calibri"/>
-          <w:i/>
-          <w:iCs/>
-        </w:rPr>
-      </w:pPr>
-      <w:r>
-        <w:rPr>
-          <w:rFonts w:ascii="Calibri" w:hAnsi="Calibri" w:cs="Calibri"/>
-          <w:i/>
-          <w:iCs/>
-        </w:rPr>
-        <w:t xml:space="preserve">(À </w:t>
-      </w:r>
-      <w:proofErr w:type="spellStart"/>
-      <w:r>
-        <w:rPr>
-          <w:rFonts w:ascii="Calibri" w:hAnsi="Calibri" w:cs="Calibri"/>
-          <w:i/>
-          <w:iCs/>
-        </w:rPr>
-        <w:t>compléter</w:t>
-      </w:r>
-      <w:proofErr w:type="spellEnd"/>
-      <w:r>
-        <w:rPr>
-          <w:rFonts w:ascii="Calibri" w:hAnsi="Calibri" w:cs="Calibri"/>
-          <w:i/>
-          <w:iCs/>
-        </w:rPr>
-        <w:t>)</w:t>
-      </w:r>
-    </w:p>
-    <w:p>
-      <w:pPr>
-        <w:pStyle w:val="Corpsdetexte"/>
-        <w:rPr>
-          <w:rFonts w:ascii="Calibri" w:hAnsi="Calibri" w:cs="Calibri"/>
-          <w:i/>
-          <w:iCs/>
-        </w:rPr>
-      </w:pPr>
-    </w:p>
-    <w:p>
-      <w:pPr>
-        <w:pStyle w:val="Corpsdetexte"/>
-        <w:rPr>
-          <w:rFonts w:ascii="Calibri" w:hAnsi="Calibri" w:cs="Calibri"/>
-          <w:i/>
-          <w:iCs/>
-        </w:rPr>
-      </w:pPr>
-    </w:p>
-    <w:p>
-      <w:pPr>
-        <w:pStyle w:val="Corpsdetexte"/>
-        <w:rPr>
-          <w:rFonts w:ascii="Calibri" w:hAnsi="Calibri" w:cs="Calibri"/>
-        </w:rPr>
-      </w:pPr>
-    </w:p>
-    <w:p>
-      <w:pPr>
-        <w:pStyle w:val="Corpsdetexte"/>
-        <w:rPr>
-          <w:rFonts w:ascii="Calibri" w:hAnsi="Calibri" w:cs="Calibri"/>
-        </w:rPr>
-      </w:pPr>
-    </w:p>
-    <w:p>
-      <w:pPr>
-        <w:pStyle w:val="Titre1"/>
-        <w:rPr>
-          <w:rFonts w:ascii="Calibri" w:hAnsi="Calibri" w:cs="Calibri"/>
-        </w:rPr>
-      </w:pPr>
-      <w:bookmarkStart w:id="4" w:name="customer-journey"/>
+      <w:bookmarkStart w:id="4" w:name="story-map"/>
       <w:bookmarkEnd w:id="3"/>
       <w:r>
         <w:rPr>
           <w:rFonts w:ascii="Calibri" w:hAnsi="Calibri" w:cs="Calibri"/>
         </w:rPr>
-        <w:lastRenderedPageBreak/>
-        <w:t>3. Customer Journey</w:t>
-      </w:r>
-    </w:p>
-    <w:p>
-      <w:pPr>
-        <w:pStyle w:val="Corpsdetexte"/>
-        <w:rPr>
-          <w:rFonts w:ascii="Calibri" w:hAnsi="Calibri" w:cs="Calibri"/>
-          <w:i/>
-          <w:iCs/>
-        </w:rPr>
-      </w:pPr>
-      <w:r>
-        <w:rPr>
-          <w:rFonts w:ascii="Calibri" w:hAnsi="Calibri" w:cs="Calibri"/>
-          <w:i/>
-          <w:iCs/>
-        </w:rPr>
-        <w:t xml:space="preserve">(À </w:t>
-      </w:r>
-      <w:proofErr w:type="spellStart"/>
-      <w:r>
-        <w:rPr>
-          <w:rFonts w:ascii="Calibri" w:hAnsi="Calibri" w:cs="Calibri"/>
-          <w:i/>
-          <w:iCs/>
-        </w:rPr>
-        <w:t>compléter</w:t>
-      </w:r>
-      <w:proofErr w:type="spellEnd"/>
-      <w:r>
-        <w:rPr>
-          <w:rFonts w:ascii="Calibri" w:hAnsi="Calibri" w:cs="Calibri"/>
-          <w:i/>
-          <w:iCs/>
-        </w:rPr>
-        <w:t>)</w:t>
-      </w:r>
-    </w:p>
-    <w:p>
-      <w:pPr>
-        <w:pStyle w:val="Corpsdetexte"/>
-        <w:rPr>
-          <w:rFonts w:ascii="Calibri" w:hAnsi="Calibri" w:cs="Calibri"/>
-          <w:i/>
-          <w:iCs/>
-        </w:rPr>
-      </w:pPr>
-    </w:p>
-    <w:p>
-      <w:pPr>
-        <w:pStyle w:val="Corpsdetexte"/>
-        <w:rPr>
-          <w:rFonts w:ascii="Calibri" w:hAnsi="Calibri" w:cs="Calibri"/>
-        </w:rPr>
-      </w:pPr>
-    </w:p>
-    <w:p>
-      <w:pPr>
-        <w:pStyle w:val="Corpsdetexte"/>
-        <w:rPr>
-          <w:rFonts w:ascii="Calibri" w:hAnsi="Calibri" w:cs="Calibri"/>
-        </w:rPr>
-      </w:pPr>
-    </w:p>
-    <w:p>
-      <w:pPr>
-        <w:pStyle w:val="Titre1"/>
-        <w:rPr>
-          <w:rFonts w:ascii="Calibri" w:hAnsi="Calibri" w:cs="Calibri"/>
-        </w:rPr>
-      </w:pPr>
-      <w:bookmarkStart w:id="5" w:name="story-map"/>
-      <w:bookmarkEnd w:id="4"/>
-      <w:r>
-        <w:rPr>
-          <w:rFonts w:ascii="Calibri" w:hAnsi="Calibri" w:cs="Calibri"/>
-        </w:rPr>
         <w:t>4. Story Map</w:t>
       </w:r>
     </w:p>
@@ -503,7 +767,7 @@
           <w:rFonts w:ascii="Calibri" w:hAnsi="Calibri" w:cs="Calibri"/>
         </w:rPr>
       </w:pPr>
-      <w:bookmarkStart w:id="6" w:name="objectif-des-modifications"/>
+      <w:bookmarkStart w:id="5" w:name="objectif-des-modifications"/>
       <w:r>
         <w:rPr>
           <w:rFonts w:ascii="Calibri" w:hAnsi="Calibri" w:cs="Calibri"/>
@@ -532,8 +796,8 @@
           <w:rFonts w:ascii="Calibri" w:hAnsi="Calibri" w:cs="Calibri"/>
         </w:rPr>
       </w:pPr>
-      <w:bookmarkStart w:id="7" w:name="modifications-apportées"/>
-      <w:bookmarkEnd w:id="6"/>
+      <w:bookmarkStart w:id="6" w:name="modifications-apportées"/>
+      <w:bookmarkEnd w:id="5"/>
       <w:r>
         <w:rPr>
           <w:rFonts w:ascii="Calibri" w:hAnsi="Calibri" w:cs="Calibri"/>
@@ -742,6 +1006,7 @@
         <w:rPr>
           <w:rFonts w:ascii="Calibri" w:hAnsi="Calibri" w:cs="Calibri"/>
         </w:rPr>
+        <w:lastRenderedPageBreak/>
         <w:t>le filtrage des résultats par étudiant ;</w:t>
       </w:r>
     </w:p>
@@ -886,14 +1151,79 @@
           <w:rFonts w:ascii="Calibri" w:hAnsi="Calibri" w:cs="Calibri"/>
         </w:rPr>
       </w:pPr>
-      <w:bookmarkStart w:id="8" w:name="release-planning"/>
-      <w:bookmarkEnd w:id="5"/>
+      <w:bookmarkStart w:id="7" w:name="release-planning"/>
+      <w:bookmarkEnd w:id="4"/>
+      <w:bookmarkEnd w:id="6"/>
+      <w:r>
+        <w:rPr>
+          <w:rFonts w:ascii="Calibri" w:hAnsi="Calibri" w:cs="Calibri"/>
+        </w:rPr>
+        <w:t>5. Release Planning</w:t>
+      </w:r>
+    </w:p>
+    <w:p>
+      <w:pPr>
+        <w:pStyle w:val="Corpsdetexte"/>
+        <w:rPr>
+          <w:rFonts w:ascii="Calibri" w:hAnsi="Calibri" w:cs="Calibri"/>
+        </w:rPr>
+      </w:pPr>
+      <w:r>
+        <w:rPr>
+          <w:rFonts w:ascii="Calibri" w:hAnsi="Calibri" w:cs="Calibri"/>
+          <w:i/>
+          <w:iCs/>
+        </w:rPr>
+        <w:t xml:space="preserve">(À </w:t>
+      </w:r>
+      <w:proofErr w:type="spellStart"/>
+      <w:r>
+        <w:rPr>
+          <w:rFonts w:ascii="Calibri" w:hAnsi="Calibri" w:cs="Calibri"/>
+          <w:i/>
+          <w:iCs/>
+        </w:rPr>
+        <w:t>compléte</w:t>
+      </w:r>
+      <w:r>
+        <w:rPr>
+          <w:rFonts w:ascii="Calibri" w:hAnsi="Calibri" w:cs="Calibri"/>
+          <w:i/>
+          <w:iCs/>
+        </w:rPr>
+        <w:t>r</w:t>
+      </w:r>
+      <w:proofErr w:type="spellEnd"/>
+      <w:r>
+        <w:rPr>
+          <w:rFonts w:ascii="Calibri" w:hAnsi="Calibri" w:cs="Calibri"/>
+          <w:i/>
+          <w:iCs/>
+        </w:rPr>
+        <w:t>)</w:t>
+      </w:r>
+    </w:p>
+    <w:p>
+      <w:pPr>
+        <w:rPr>
+          <w:rFonts w:ascii="Calibri" w:hAnsi="Calibri" w:cs="Calibri"/>
+        </w:rPr>
+      </w:pPr>
+    </w:p>
+    <w:p>
+      <w:pPr>
+        <w:pStyle w:val="Titre1"/>
+        <w:rPr>
+          <w:rFonts w:ascii="Calibri" w:hAnsi="Calibri" w:cs="Calibri"/>
+        </w:rPr>
+      </w:pPr>
+      <w:bookmarkStart w:id="8" w:name="product-backlog"/>
       <w:bookmarkEnd w:id="7"/>
       <w:r>
         <w:rPr>
           <w:rFonts w:ascii="Calibri" w:hAnsi="Calibri" w:cs="Calibri"/>
         </w:rPr>
-        <w:t>5. Release Planning</w:t>
+        <w:t>6. Product Backlog</w:t>
       </w:r>
     </w:p>
     <w:p>
@@ -901,6 +1231,8 @@
         <w:pStyle w:val="Corpsdetexte"/>
         <w:rPr>
           <w:rFonts w:ascii="Calibri" w:hAnsi="Calibri" w:cs="Calibri"/>
+          <w:i/>
+          <w:iCs/>
         </w:rPr>
       </w:pPr>
       <w:r>
@@ -918,15 +1250,7 @@
           <w:i/>
           <w:iCs/>
         </w:rPr>
-        <w:t>compléte</w:t>
-      </w:r>
-      <w:r>
-        <w:rPr>
-          <w:rFonts w:ascii="Calibri" w:hAnsi="Calibri" w:cs="Calibri"/>
-          <w:i/>
-          <w:iCs/>
-        </w:rPr>
-        <w:t>r</w:t>
+        <w:t>compléter</w:t>
       </w:r>
       <w:proofErr w:type="spellEnd"/>
       <w:r>
@@ -940,6 +1264,44 @@
     </w:p>
     <w:p>
       <w:pPr>
+        <w:pStyle w:val="Corpsdetexte"/>
+        <w:rPr>
+          <w:rFonts w:ascii="Calibri" w:hAnsi="Calibri" w:cs="Calibri"/>
+          <w:i/>
+          <w:iCs/>
+        </w:rPr>
+      </w:pPr>
+    </w:p>
+    <w:p>
+      <w:pPr>
+        <w:pStyle w:val="Corpsdetexte"/>
+        <w:rPr>
+          <w:rFonts w:ascii="Calibri" w:hAnsi="Calibri" w:cs="Calibri"/>
+          <w:i/>
+          <w:iCs/>
+        </w:rPr>
+      </w:pPr>
+    </w:p>
+    <w:p>
+      <w:pPr>
+        <w:pStyle w:val="Corpsdetexte"/>
+        <w:rPr>
+          <w:rFonts w:ascii="Calibri" w:hAnsi="Calibri" w:cs="Calibri"/>
+          <w:i/>
+          <w:iCs/>
+        </w:rPr>
+      </w:pPr>
+    </w:p>
+    <w:p>
+      <w:pPr>
+        <w:pStyle w:val="Corpsdetexte"/>
+        <w:rPr>
+          <w:rFonts w:ascii="Calibri" w:hAnsi="Calibri" w:cs="Calibri"/>
+        </w:rPr>
+      </w:pPr>
+    </w:p>
+    <w:p>
+      <w:pPr>
         <w:rPr>
           <w:rFonts w:ascii="Calibri" w:hAnsi="Calibri" w:cs="Calibri"/>
         </w:rPr>
@@ -952,14 +1314,13 @@
           <w:rFonts w:ascii="Calibri" w:hAnsi="Calibri" w:cs="Calibri"/>
         </w:rPr>
       </w:pPr>
-      <w:bookmarkStart w:id="9" w:name="product-backlog"/>
+      <w:bookmarkStart w:id="9" w:name="sprint-backlog"/>
       <w:bookmarkEnd w:id="8"/>
       <w:r>
         <w:rPr>
           <w:rFonts w:ascii="Calibri" w:hAnsi="Calibri" w:cs="Calibri"/>
         </w:rPr>
-        <w:lastRenderedPageBreak/>
-        <w:t>6. Product Backlog</w:t>
+        <w:t>7. Sprint Backlog</w:t>
       </w:r>
     </w:p>
     <w:p>
@@ -1043,119 +1404,7 @@
         </w:rPr>
       </w:pPr>
     </w:p>
-    <w:p>
-      <w:pPr>
-        <w:pStyle w:val="Titre1"/>
-        <w:rPr>
-          <w:rFonts w:ascii="Calibri" w:hAnsi="Calibri" w:cs="Calibri"/>
-        </w:rPr>
-      </w:pPr>
-      <w:bookmarkStart w:id="10" w:name="sprint-backlog"/>
-      <w:bookmarkEnd w:id="9"/>
-      <w:r>
-        <w:rPr>
-          <w:rFonts w:ascii="Calibri" w:hAnsi="Calibri" w:cs="Calibri"/>
-        </w:rPr>
-        <w:t>7. Sprint Backlog</w:t>
-      </w:r>
-    </w:p>
-    <w:p>
-      <w:pPr>
-        <w:pStyle w:val="Corpsdetexte"/>
-        <w:rPr>
-          <w:rFonts w:ascii="Calibri" w:hAnsi="Calibri" w:cs="Calibri"/>
-          <w:i/>
-          <w:iCs/>
-        </w:rPr>
-      </w:pPr>
-      <w:r>
-        <w:rPr>
-          <w:rFonts w:ascii="Calibri" w:hAnsi="Calibri" w:cs="Calibri"/>
-          <w:i/>
-          <w:iCs/>
-        </w:rPr>
-        <w:t xml:space="preserve">(À </w:t>
-      </w:r>
-      <w:proofErr w:type="spellStart"/>
-      <w:r>
-        <w:rPr>
-          <w:rFonts w:ascii="Calibri" w:hAnsi="Calibri" w:cs="Calibri"/>
-          <w:i/>
-          <w:iCs/>
-        </w:rPr>
-        <w:t>compléter</w:t>
-      </w:r>
-      <w:proofErr w:type="spellEnd"/>
-      <w:r>
-        <w:rPr>
-          <w:rFonts w:ascii="Calibri" w:hAnsi="Calibri" w:cs="Calibri"/>
-          <w:i/>
-          <w:iCs/>
-        </w:rPr>
-        <w:t>)</w:t>
-      </w:r>
-    </w:p>
-    <w:p>
-      <w:pPr>
-        <w:pStyle w:val="Corpsdetexte"/>
-        <w:rPr>
-          <w:rFonts w:ascii="Calibri" w:hAnsi="Calibri" w:cs="Calibri"/>
-          <w:i/>
-          <w:iCs/>
-        </w:rPr>
-      </w:pPr>
-    </w:p>
-    <w:p>
-      <w:pPr>
-        <w:pStyle w:val="Corpsdetexte"/>
-        <w:rPr>
-          <w:rFonts w:ascii="Calibri" w:hAnsi="Calibri" w:cs="Calibri"/>
-          <w:i/>
-          <w:iCs/>
-        </w:rPr>
-      </w:pPr>
-    </w:p>
-    <w:p>
-      <w:pPr>
-        <w:pStyle w:val="Corpsdetexte"/>
-        <w:rPr>
-          <w:rFonts w:ascii="Calibri" w:hAnsi="Calibri" w:cs="Calibri"/>
-          <w:i/>
-          <w:iCs/>
-        </w:rPr>
-      </w:pPr>
-    </w:p>
-    <w:p>
-      <w:pPr>
-        <w:pStyle w:val="Corpsdetexte"/>
-        <w:rPr>
-          <w:rFonts w:ascii="Calibri" w:hAnsi="Calibri" w:cs="Calibri"/>
-        </w:rPr>
-      </w:pPr>
-    </w:p>
-    <w:p>
-      <w:pPr>
-        <w:rPr>
-          <w:rFonts w:ascii="Calibri" w:hAnsi="Calibri" w:cs="Calibri"/>
-        </w:rPr>
-      </w:pPr>
-    </w:p>
-    <w:p>
-      <w:pPr>
-        <w:pStyle w:val="Titre1"/>
-        <w:rPr>
-          <w:rFonts w:ascii="Calibri" w:hAnsi="Calibri" w:cs="Calibri"/>
-        </w:rPr>
-      </w:pPr>
-      <w:bookmarkStart w:id="11" w:name="conclusion"/>
-      <w:bookmarkEnd w:id="10"/>
-      <w:r>
-        <w:rPr>
-          <w:rFonts w:ascii="Calibri" w:hAnsi="Calibri" w:cs="Calibri"/>
-        </w:rPr>
-        <w:t>Conclusion</w:t>
-      </w:r>
-    </w:p>
+    <w:bookmarkEnd w:id="9"/>
     <w:p>
       <w:pPr>
         <w:pStyle w:val="FirstParagraph"/>
@@ -1163,13 +1412,6 @@
           <w:rFonts w:ascii="Calibri" w:hAnsi="Calibri" w:cs="Calibri"/>
         </w:rPr>
       </w:pPr>
-      <w:r>
-        <w:rPr>
-          <w:rFonts w:ascii="Calibri" w:hAnsi="Calibri" w:cs="Calibri"/>
-        </w:rPr>
-        <w:t>L’équipe a choisi d’intégrer la nouvelle cible enseignante sans remettre en cause le cœur du MVP étudiant. Les nouveaux besoins ont été répartis dans les différents artefacts afin de conserver la cohérence globale du produit et de préparer leur implémentation lors des prochains sprints.</w:t>
-      </w:r>
-      <w:bookmarkEnd w:id="11"/>
     </w:p>
     <w:sectPr>
       <w:footnotePr>
@@ -1366,6 +1608,155 @@
       </w:rPr>
     </w:lvl>
   </w:abstractNum>
+  <w:abstractNum w:abstractNumId="2" w15:restartNumberingAfterBreak="0">
+    <w:nsid w:val="7C092FE1"/>
+    <w:multiLevelType w:val="multilevel"/>
+    <w:tmpl w:val="210E7812"/>
+    <w:lvl w:ilvl="0">
+      <w:start w:val="1"/>
+      <w:numFmt w:val="bullet"/>
+      <w:lvlText w:val=""/>
+      <w:lvlJc w:val="left"/>
+      <w:pPr>
+        <w:tabs>
+          <w:tab w:val="num" w:pos="720"/>
+        </w:tabs>
+        <w:ind w:left="720" w:hanging="360"/>
+      </w:pPr>
+      <w:rPr>
+        <w:rFonts w:ascii="Symbol" w:hAnsi="Symbol" w:hint="default"/>
+        <w:sz w:val="20"/>
+      </w:rPr>
+    </w:lvl>
+    <w:lvl w:ilvl="1" w:tentative="1">
+      <w:start w:val="1"/>
+      <w:numFmt w:val="bullet"/>
+      <w:lvlText w:val="o"/>
+      <w:lvlJc w:val="left"/>
+      <w:pPr>
+        <w:tabs>
+          <w:tab w:val="num" w:pos="1440"/>
+        </w:tabs>
+        <w:ind w:left="1440" w:hanging="360"/>
+      </w:pPr>
+      <w:rPr>
+        <w:rFonts w:ascii="Courier New" w:hAnsi="Courier New" w:hint="default"/>
+        <w:sz w:val="20"/>
+      </w:rPr>
+    </w:lvl>
+    <w:lvl w:ilvl="2" w:tentative="1">
+      <w:start w:val="1"/>
+      <w:numFmt w:val="bullet"/>
+      <w:lvlText w:val=""/>
+      <w:lvlJc w:val="left"/>
+      <w:pPr>
+        <w:tabs>
+          <w:tab w:val="num" w:pos="2160"/>
+        </w:tabs>
+        <w:ind w:left="2160" w:hanging="360"/>
+      </w:pPr>
+      <w:rPr>
+        <w:rFonts w:ascii="Wingdings" w:hAnsi="Wingdings" w:hint="default"/>
+        <w:sz w:val="20"/>
+      </w:rPr>
+    </w:lvl>
+    <w:lvl w:ilvl="3" w:tentative="1">
+      <w:start w:val="1"/>
+      <w:numFmt w:val="bullet"/>
+      <w:lvlText w:val=""/>
+      <w:lvlJc w:val="left"/>
+      <w:pPr>
+        <w:tabs>
+          <w:tab w:val="num" w:pos="2880"/>
+        </w:tabs>
+        <w:ind w:left="2880" w:hanging="360"/>
+      </w:pPr>
+      <w:rPr>
+        <w:rFonts w:ascii="Wingdings" w:hAnsi="Wingdings" w:hint="default"/>
+        <w:sz w:val="20"/>
+      </w:rPr>
+    </w:lvl>
+    <w:lvl w:ilvl="4" w:tentative="1">
+      <w:start w:val="1"/>
+      <w:numFmt w:val="bullet"/>
+      <w:lvlText w:val=""/>
+      <w:lvlJc w:val="left"/>
+      <w:pPr>
+        <w:tabs>
+          <w:tab w:val="num" w:pos="3600"/>
+        </w:tabs>
+        <w:ind w:left="3600" w:hanging="360"/>
+      </w:pPr>
+      <w:rPr>
+        <w:rFonts w:ascii="Wingdings" w:hAnsi="Wingdings" w:hint="default"/>
+        <w:sz w:val="20"/>
+      </w:rPr>
+    </w:lvl>
+    <w:lvl w:ilvl="5" w:tentative="1">
+      <w:start w:val="1"/>
+      <w:numFmt w:val="bullet"/>
+      <w:lvlText w:val=""/>
+      <w:lvlJc w:val="left"/>
+      <w:pPr>
+        <w:tabs>
+          <w:tab w:val="num" w:pos="4320"/>
+        </w:tabs>
+        <w:ind w:left="4320" w:hanging="360"/>
+      </w:pPr>
+      <w:rPr>
+        <w:rFonts w:ascii="Wingdings" w:hAnsi="Wingdings" w:hint="default"/>
+        <w:sz w:val="20"/>
+      </w:rPr>
+    </w:lvl>
+    <w:lvl w:ilvl="6" w:tentative="1">
+      <w:start w:val="1"/>
+      <w:numFmt w:val="bullet"/>
+      <w:lvlText w:val=""/>
+      <w:lvlJc w:val="left"/>
+      <w:pPr>
+        <w:tabs>
+          <w:tab w:val="num" w:pos="5040"/>
+        </w:tabs>
+        <w:ind w:left="5040" w:hanging="360"/>
+      </w:pPr>
+      <w:rPr>
+        <w:rFonts w:ascii="Wingdings" w:hAnsi="Wingdings" w:hint="default"/>
+        <w:sz w:val="20"/>
+      </w:rPr>
+    </w:lvl>
+    <w:lvl w:ilvl="7" w:tentative="1">
+      <w:start w:val="1"/>
+      <w:numFmt w:val="bullet"/>
+      <w:lvlText w:val=""/>
+      <w:lvlJc w:val="left"/>
+      <w:pPr>
+        <w:tabs>
+          <w:tab w:val="num" w:pos="5760"/>
+        </w:tabs>
+        <w:ind w:left="5760" w:hanging="360"/>
+      </w:pPr>
+      <w:rPr>
+        <w:rFonts w:ascii="Wingdings" w:hAnsi="Wingdings" w:hint="default"/>
+        <w:sz w:val="20"/>
+      </w:rPr>
+    </w:lvl>
+    <w:lvl w:ilvl="8" w:tentative="1">
+      <w:start w:val="1"/>
+      <w:numFmt w:val="bullet"/>
+      <w:lvlText w:val=""/>
+      <w:lvlJc w:val="left"/>
+      <w:pPr>
+        <w:tabs>
+          <w:tab w:val="num" w:pos="6480"/>
+        </w:tabs>
+        <w:ind w:left="6480" w:hanging="360"/>
+      </w:pPr>
+      <w:rPr>
+        <w:rFonts w:ascii="Wingdings" w:hAnsi="Wingdings" w:hint="default"/>
+        <w:sz w:val="20"/>
+      </w:rPr>
+    </w:lvl>
+  </w:abstractNum>
   <w:num w:numId="1" w16cid:durableId="531380223">
     <w:abstractNumId w:val="0"/>
   </w:num>
@@ -1374,6 +1765,9 @@
   </w:num>
   <w:num w:numId="3" w16cid:durableId="1349671369">
     <w:abstractNumId w:val="1"/>
+  </w:num>
+  <w:num w:numId="4" w16cid:durableId="1407846993">
+    <w:abstractNumId w:val="2"/>
   </w:num>
 </w:numbering>
 </file>
@@ -1844,7 +2238,6 @@
   <w:style w:type="character" w:default="1" w:styleId="Policepardfaut">
     <w:name w:val="Default Paragraph Font"/>
     <w:uiPriority w:val="1"/>
-    <w:semiHidden/>
     <w:unhideWhenUsed/>
   </w:style>
   <w:style w:type="table" w:default="1" w:styleId="TableauNormal">

</xml_diff>